<commit_message>
UPdated the Meeting minutes for week 4
</commit_message>
<xml_diff>
--- a/Week 4 - Researched Components added.docx
+++ b/Week 4 - Researched Components added.docx
@@ -2565,6 +2565,12 @@
           </w:r>
         </w:p>
         <w:p>
+          <w:pPr>
+            <w:rPr>
+              <w:rFonts w:ascii="Aptos" w:hAnsi="Aptos"/>
+              <w:color w:val="000000"/>
+            </w:rPr>
+          </w:pPr>
           <w:r>
             <w:rPr>
               <w:rFonts w:eastAsia="Times New Roman"/>
@@ -2574,6 +2580,864 @@
         </w:p>
       </w:sdtContent>
     </w:sdt>
+    <w:p>
+      <w:pPr>
+        <w:rPr>
+          <w:rFonts w:ascii="Aptos" w:hAnsi="Aptos"/>
+          <w:color w:val="000000"/>
+        </w:rPr>
+      </w:pPr>
+    </w:p>
+    <w:p>
+      <w:pPr>
+        <w:rPr>
+          <w:rFonts w:ascii="Aptos" w:hAnsi="Aptos"/>
+          <w:color w:val="000000"/>
+        </w:rPr>
+      </w:pPr>
+    </w:p>
+    <w:p>
+      <w:pPr>
+        <w:rPr>
+          <w:rFonts w:ascii="Aptos" w:hAnsi="Aptos"/>
+          <w:color w:val="000000"/>
+        </w:rPr>
+      </w:pPr>
+    </w:p>
+    <w:p>
+      <w:pPr>
+        <w:rPr>
+          <w:rFonts w:ascii="Aptos" w:hAnsi="Aptos"/>
+          <w:color w:val="000000"/>
+        </w:rPr>
+      </w:pPr>
+    </w:p>
+    <w:p>
+      <w:pPr>
+        <w:rPr>
+          <w:rFonts w:ascii="Aptos" w:hAnsi="Aptos"/>
+          <w:color w:val="000000"/>
+        </w:rPr>
+      </w:pPr>
+    </w:p>
+    <w:p>
+      <w:pPr>
+        <w:rPr>
+          <w:rFonts w:ascii="Aptos" w:hAnsi="Aptos"/>
+          <w:color w:val="000000"/>
+        </w:rPr>
+      </w:pPr>
+    </w:p>
+    <w:p>
+      <w:pPr>
+        <w:rPr>
+          <w:rFonts w:ascii="Aptos" w:hAnsi="Aptos"/>
+          <w:color w:val="000000"/>
+        </w:rPr>
+      </w:pPr>
+      <w:r>
+        <w:rPr>
+          <w:rFonts w:ascii="Aptos" w:hAnsi="Aptos"/>
+          <w:color w:val="000000"/>
+        </w:rPr>
+        <w:lastRenderedPageBreak/>
+        <w:t xml:space="preserve">Week 4 Meeting Minutes: </w:t>
+      </w:r>
+    </w:p>
+    <w:p>
+      <w:pPr>
+        <w:rPr>
+          <w:rFonts w:ascii="Aptos" w:hAnsi="Aptos"/>
+          <w:color w:val="000000"/>
+        </w:rPr>
+      </w:pPr>
+    </w:p>
+    <w:p>
+      <w:pPr>
+        <w:rPr>
+          <w:rFonts w:ascii="Aptos" w:hAnsi="Aptos"/>
+          <w:b/>
+          <w:bCs/>
+          <w:color w:val="000000"/>
+        </w:rPr>
+      </w:pPr>
+      <w:r>
+        <w:rPr>
+          <w:rFonts w:ascii="Aptos" w:hAnsi="Aptos"/>
+          <w:b/>
+          <w:bCs/>
+          <w:color w:val="000000"/>
+        </w:rPr>
+        <w:t xml:space="preserve"> </w:t>
+      </w:r>
+      <w:r>
+        <w:rPr>
+          <w:rFonts w:ascii="Aptos" w:hAnsi="Aptos"/>
+          <w:b/>
+          <w:bCs/>
+          <w:color w:val="000000"/>
+        </w:rPr>
+        <w:t>Project Focus &amp; Scope</w:t>
+      </w:r>
+    </w:p>
+    <w:p>
+      <w:pPr>
+        <w:pStyle w:val="ListParagraph"/>
+        <w:numPr>
+          <w:ilvl w:val="0"/>
+          <w:numId w:val="4"/>
+        </w:numPr>
+        <w:rPr>
+          <w:rFonts w:ascii="Aptos" w:hAnsi="Aptos"/>
+          <w:color w:val="000000"/>
+        </w:rPr>
+      </w:pPr>
+      <w:r>
+        <w:rPr>
+          <w:rFonts w:ascii="Aptos" w:hAnsi="Aptos"/>
+          <w:color w:val="000000"/>
+        </w:rPr>
+        <w:t>The project needs to be reduced to a single, distinct goal.</w:t>
+      </w:r>
+    </w:p>
+    <w:p>
+      <w:pPr>
+        <w:pStyle w:val="ListParagraph"/>
+        <w:numPr>
+          <w:ilvl w:val="0"/>
+          <w:numId w:val="4"/>
+        </w:numPr>
+        <w:rPr>
+          <w:rFonts w:ascii="Aptos" w:hAnsi="Aptos"/>
+          <w:color w:val="000000"/>
+        </w:rPr>
+      </w:pPr>
+      <w:r>
+        <w:rPr>
+          <w:rFonts w:ascii="Aptos" w:hAnsi="Aptos"/>
+          <w:color w:val="000000"/>
+        </w:rPr>
+        <w:t>Determine the wearable's main purpose:</w:t>
+      </w:r>
+    </w:p>
+    <w:p>
+      <w:pPr>
+        <w:pStyle w:val="ListParagraph"/>
+        <w:numPr>
+          <w:ilvl w:val="1"/>
+          <w:numId w:val="4"/>
+        </w:numPr>
+        <w:rPr>
+          <w:rFonts w:ascii="Aptos" w:hAnsi="Aptos"/>
+          <w:color w:val="000000"/>
+        </w:rPr>
+      </w:pPr>
+      <w:r>
+        <w:rPr>
+          <w:rFonts w:ascii="Aptos" w:hAnsi="Aptos"/>
+          <w:color w:val="000000"/>
+        </w:rPr>
+        <w:t>Workplace Safety and Health (WHS)</w:t>
+      </w:r>
+    </w:p>
+    <w:p>
+      <w:pPr>
+        <w:pStyle w:val="ListParagraph"/>
+        <w:numPr>
+          <w:ilvl w:val="1"/>
+          <w:numId w:val="4"/>
+        </w:numPr>
+        <w:rPr>
+          <w:rFonts w:ascii="Aptos" w:hAnsi="Aptos"/>
+          <w:color w:val="000000"/>
+        </w:rPr>
+      </w:pPr>
+      <w:r>
+        <w:rPr>
+          <w:rFonts w:ascii="Aptos" w:hAnsi="Aptos"/>
+          <w:color w:val="000000"/>
+        </w:rPr>
+        <w:t>or Patient/Health Monitoring</w:t>
+      </w:r>
+    </w:p>
+    <w:p>
+      <w:pPr>
+        <w:pStyle w:val="ListParagraph"/>
+        <w:numPr>
+          <w:ilvl w:val="1"/>
+          <w:numId w:val="4"/>
+        </w:numPr>
+        <w:rPr>
+          <w:rFonts w:ascii="Aptos" w:hAnsi="Aptos"/>
+          <w:color w:val="000000"/>
+        </w:rPr>
+      </w:pPr>
+      <w:r>
+        <w:rPr>
+          <w:rFonts w:ascii="Aptos" w:hAnsi="Aptos"/>
+          <w:color w:val="000000"/>
+        </w:rPr>
+        <w:t>Don't create a wearable that can do everything.</w:t>
+      </w:r>
+    </w:p>
+    <w:p>
+      <w:pPr>
+        <w:pStyle w:val="ListParagraph"/>
+        <w:numPr>
+          <w:ilvl w:val="0"/>
+          <w:numId w:val="5"/>
+        </w:numPr>
+        <w:rPr>
+          <w:rFonts w:ascii="Aptos" w:hAnsi="Aptos"/>
+          <w:color w:val="000000"/>
+        </w:rPr>
+      </w:pPr>
+      <w:r>
+        <w:rPr>
+          <w:rFonts w:ascii="Aptos" w:hAnsi="Aptos"/>
+          <w:color w:val="000000"/>
+        </w:rPr>
+        <w:t>Concentrate on one main use case, mentioning the others simply as potential extensions.</w:t>
+      </w:r>
+    </w:p>
+    <w:p>
+      <w:pPr>
+        <w:pStyle w:val="ListParagraph"/>
+        <w:rPr>
+          <w:rFonts w:ascii="Aptos" w:hAnsi="Aptos"/>
+          <w:color w:val="000000"/>
+        </w:rPr>
+      </w:pPr>
+    </w:p>
+    <w:p>
+      <w:pPr>
+        <w:rPr>
+          <w:rFonts w:ascii="Aptos" w:hAnsi="Aptos"/>
+          <w:b/>
+          <w:bCs/>
+          <w:color w:val="000000"/>
+        </w:rPr>
+      </w:pPr>
+      <w:r>
+        <w:rPr>
+          <w:rFonts w:ascii="Aptos" w:hAnsi="Aptos"/>
+          <w:b/>
+          <w:bCs/>
+          <w:color w:val="000000"/>
+        </w:rPr>
+        <w:t>Measurements &amp; Data Collection</w:t>
+      </w:r>
+    </w:p>
+    <w:p>
+      <w:pPr>
+        <w:pStyle w:val="ListParagraph"/>
+        <w:numPr>
+          <w:ilvl w:val="0"/>
+          <w:numId w:val="5"/>
+        </w:numPr>
+        <w:rPr>
+          <w:rFonts w:ascii="Aptos" w:hAnsi="Aptos"/>
+          <w:color w:val="000000"/>
+        </w:rPr>
+      </w:pPr>
+      <w:r>
+        <w:rPr>
+          <w:rFonts w:ascii="Aptos" w:hAnsi="Aptos"/>
+          <w:color w:val="000000"/>
+        </w:rPr>
+        <w:t>Clearly state the metrics that the wearable will take</w:t>
+      </w:r>
+    </w:p>
+    <w:p>
+      <w:pPr>
+        <w:pStyle w:val="ListParagraph"/>
+        <w:numPr>
+          <w:ilvl w:val="0"/>
+          <w:numId w:val="5"/>
+        </w:numPr>
+        <w:rPr>
+          <w:rFonts w:ascii="Aptos" w:hAnsi="Aptos"/>
+          <w:color w:val="000000"/>
+        </w:rPr>
+      </w:pPr>
+      <w:r>
+        <w:rPr>
+          <w:rFonts w:ascii="Aptos" w:hAnsi="Aptos"/>
+          <w:color w:val="000000"/>
+        </w:rPr>
+        <w:t>The selected use case must be directly supported by the measurements.</w:t>
+      </w:r>
+    </w:p>
+    <w:p>
+      <w:pPr>
+        <w:pStyle w:val="ListParagraph"/>
+        <w:numPr>
+          <w:ilvl w:val="0"/>
+          <w:numId w:val="5"/>
+        </w:numPr>
+        <w:rPr>
+          <w:rFonts w:ascii="Aptos" w:hAnsi="Aptos"/>
+          <w:color w:val="000000"/>
+        </w:rPr>
+      </w:pPr>
+      <w:r>
+        <w:rPr>
+          <w:rFonts w:ascii="Aptos" w:hAnsi="Aptos"/>
+          <w:color w:val="000000"/>
+        </w:rPr>
+        <w:t>Examples of measurements (not all at once):</w:t>
+      </w:r>
+    </w:p>
+    <w:p>
+      <w:pPr>
+        <w:pStyle w:val="ListParagraph"/>
+        <w:numPr>
+          <w:ilvl w:val="1"/>
+          <w:numId w:val="5"/>
+        </w:numPr>
+        <w:rPr>
+          <w:rFonts w:ascii="Aptos" w:hAnsi="Aptos"/>
+          <w:color w:val="000000"/>
+        </w:rPr>
+      </w:pPr>
+      <w:r>
+        <w:rPr>
+          <w:rFonts w:ascii="Aptos" w:hAnsi="Aptos"/>
+          <w:color w:val="000000"/>
+        </w:rPr>
+        <w:t>Heart rate</w:t>
+      </w:r>
+    </w:p>
+    <w:p>
+      <w:pPr>
+        <w:pStyle w:val="ListParagraph"/>
+        <w:numPr>
+          <w:ilvl w:val="1"/>
+          <w:numId w:val="5"/>
+        </w:numPr>
+        <w:rPr>
+          <w:rFonts w:ascii="Aptos" w:hAnsi="Aptos"/>
+          <w:color w:val="000000"/>
+        </w:rPr>
+      </w:pPr>
+      <w:r>
+        <w:rPr>
+          <w:rFonts w:ascii="Aptos" w:hAnsi="Aptos"/>
+          <w:color w:val="000000"/>
+        </w:rPr>
+        <w:t>Movement and steps</w:t>
+      </w:r>
+    </w:p>
+    <w:p>
+      <w:pPr>
+        <w:pStyle w:val="ListParagraph"/>
+        <w:numPr>
+          <w:ilvl w:val="1"/>
+          <w:numId w:val="5"/>
+        </w:numPr>
+        <w:rPr>
+          <w:rFonts w:ascii="Aptos" w:hAnsi="Aptos"/>
+          <w:color w:val="000000"/>
+        </w:rPr>
+      </w:pPr>
+      <w:r>
+        <w:rPr>
+          <w:rFonts w:ascii="Aptos" w:hAnsi="Aptos"/>
+          <w:color w:val="000000"/>
+        </w:rPr>
+        <w:t>D</w:t>
+      </w:r>
+      <w:r>
+        <w:rPr>
+          <w:rFonts w:ascii="Aptos" w:hAnsi="Aptos"/>
+          <w:color w:val="000000"/>
+        </w:rPr>
+        <w:t>egree of activity</w:t>
+      </w:r>
+    </w:p>
+    <w:p>
+      <w:pPr>
+        <w:pStyle w:val="ListParagraph"/>
+        <w:numPr>
+          <w:ilvl w:val="0"/>
+          <w:numId w:val="6"/>
+        </w:numPr>
+        <w:rPr>
+          <w:rFonts w:ascii="Aptos" w:hAnsi="Aptos"/>
+          <w:color w:val="000000"/>
+        </w:rPr>
+      </w:pPr>
+      <w:r>
+        <w:rPr>
+          <w:rFonts w:ascii="Aptos" w:hAnsi="Aptos"/>
+          <w:color w:val="000000"/>
+        </w:rPr>
+        <w:t>No extraneous sensors unless they are essential to the main function.</w:t>
+      </w:r>
+    </w:p>
+    <w:p>
+      <w:pPr>
+        <w:rPr>
+          <w:rFonts w:ascii="Aptos" w:hAnsi="Aptos"/>
+          <w:b/>
+          <w:bCs/>
+          <w:color w:val="000000"/>
+        </w:rPr>
+      </w:pPr>
+    </w:p>
+    <w:p>
+      <w:pPr>
+        <w:rPr>
+          <w:rFonts w:ascii="Aptos" w:hAnsi="Aptos"/>
+          <w:b/>
+          <w:bCs/>
+          <w:color w:val="000000"/>
+        </w:rPr>
+      </w:pPr>
+      <w:r>
+        <w:rPr>
+          <w:rFonts w:ascii="Aptos" w:hAnsi="Aptos"/>
+          <w:b/>
+          <w:bCs/>
+          <w:color w:val="000000"/>
+        </w:rPr>
+        <w:t>Machine Learning &amp; Algorithms</w:t>
+      </w:r>
+    </w:p>
+    <w:p>
+      <w:pPr>
+        <w:pStyle w:val="ListParagraph"/>
+        <w:numPr>
+          <w:ilvl w:val="0"/>
+          <w:numId w:val="6"/>
+        </w:numPr>
+        <w:rPr>
+          <w:rFonts w:ascii="Aptos" w:hAnsi="Aptos"/>
+          <w:color w:val="000000"/>
+        </w:rPr>
+      </w:pPr>
+      <w:r>
+        <w:rPr>
+          <w:rFonts w:ascii="Aptos" w:hAnsi="Aptos"/>
+          <w:color w:val="000000"/>
+        </w:rPr>
+        <w:t>ML ought to be:</w:t>
+      </w:r>
+    </w:p>
+    <w:p>
+      <w:pPr>
+        <w:pStyle w:val="ListParagraph"/>
+        <w:numPr>
+          <w:ilvl w:val="1"/>
+          <w:numId w:val="6"/>
+        </w:numPr>
+        <w:rPr>
+          <w:rFonts w:ascii="Aptos" w:hAnsi="Aptos"/>
+          <w:color w:val="000000"/>
+        </w:rPr>
+      </w:pPr>
+      <w:r>
+        <w:rPr>
+          <w:rFonts w:ascii="Aptos" w:hAnsi="Aptos"/>
+          <w:color w:val="000000"/>
+        </w:rPr>
+        <w:t>Lightweight</w:t>
+      </w:r>
+    </w:p>
+    <w:p>
+      <w:pPr>
+        <w:pStyle w:val="ListParagraph"/>
+        <w:numPr>
+          <w:ilvl w:val="1"/>
+          <w:numId w:val="6"/>
+        </w:numPr>
+        <w:rPr>
+          <w:rFonts w:ascii="Aptos" w:hAnsi="Aptos"/>
+          <w:color w:val="000000"/>
+        </w:rPr>
+      </w:pPr>
+      <w:r>
+        <w:rPr>
+          <w:rFonts w:ascii="Aptos" w:hAnsi="Aptos"/>
+          <w:color w:val="000000"/>
+        </w:rPr>
+        <w:t>Adequate for microcontroller operation</w:t>
+      </w:r>
+    </w:p>
+    <w:p>
+      <w:pPr>
+        <w:pStyle w:val="ListParagraph"/>
+        <w:numPr>
+          <w:ilvl w:val="0"/>
+          <w:numId w:val="6"/>
+        </w:numPr>
+        <w:rPr>
+          <w:rFonts w:ascii="Aptos" w:hAnsi="Aptos"/>
+          <w:color w:val="000000"/>
+        </w:rPr>
+      </w:pPr>
+      <w:r>
+        <w:rPr>
+          <w:rFonts w:ascii="Aptos" w:hAnsi="Aptos"/>
+          <w:color w:val="000000"/>
+        </w:rPr>
+        <w:t>To begin with:</w:t>
+      </w:r>
+    </w:p>
+    <w:p>
+      <w:pPr>
+        <w:pStyle w:val="ListParagraph"/>
+        <w:numPr>
+          <w:ilvl w:val="1"/>
+          <w:numId w:val="6"/>
+        </w:numPr>
+        <w:rPr>
+          <w:rFonts w:ascii="Aptos" w:hAnsi="Aptos"/>
+          <w:color w:val="000000"/>
+        </w:rPr>
+      </w:pPr>
+      <w:r>
+        <w:rPr>
+          <w:rFonts w:ascii="Aptos" w:hAnsi="Aptos"/>
+          <w:color w:val="000000"/>
+        </w:rPr>
+        <w:t>A basic rule-based algorithm or machine learning model</w:t>
+      </w:r>
+    </w:p>
+    <w:p>
+      <w:pPr>
+        <w:pStyle w:val="ListParagraph"/>
+        <w:numPr>
+          <w:ilvl w:val="1"/>
+          <w:numId w:val="6"/>
+        </w:numPr>
+        <w:rPr>
+          <w:rFonts w:ascii="Aptos" w:hAnsi="Aptos"/>
+          <w:color w:val="000000"/>
+        </w:rPr>
+      </w:pPr>
+      <w:r>
+        <w:rPr>
+          <w:rFonts w:ascii="Aptos" w:hAnsi="Aptos"/>
+          <w:color w:val="000000"/>
+        </w:rPr>
+        <w:t>Test performance first (feasibility, accuracy).</w:t>
+      </w:r>
+    </w:p>
+    <w:p>
+      <w:pPr>
+        <w:pStyle w:val="ListParagraph"/>
+        <w:numPr>
+          <w:ilvl w:val="0"/>
+          <w:numId w:val="6"/>
+        </w:numPr>
+        <w:rPr>
+          <w:rFonts w:ascii="Aptos" w:hAnsi="Aptos"/>
+          <w:color w:val="000000"/>
+        </w:rPr>
+      </w:pPr>
+      <w:r>
+        <w:rPr>
+          <w:rFonts w:ascii="Aptos" w:hAnsi="Aptos"/>
+          <w:color w:val="000000"/>
+        </w:rPr>
+        <w:t>At first, stay away from complicated models.</w:t>
+      </w:r>
+    </w:p>
+    <w:p>
+      <w:pPr>
+        <w:pStyle w:val="ListParagraph"/>
+        <w:numPr>
+          <w:ilvl w:val="0"/>
+          <w:numId w:val="6"/>
+        </w:numPr>
+        <w:rPr>
+          <w:rFonts w:ascii="Aptos" w:hAnsi="Aptos"/>
+          <w:color w:val="000000"/>
+        </w:rPr>
+      </w:pPr>
+      <w:r>
+        <w:rPr>
+          <w:rFonts w:ascii="Aptos" w:hAnsi="Aptos"/>
+          <w:color w:val="000000"/>
+        </w:rPr>
+        <w:t>ML isn't just utilized for complexity; it's also used when it adds value.</w:t>
+      </w:r>
+    </w:p>
+    <w:p>
+      <w:pPr>
+        <w:rPr>
+          <w:rFonts w:ascii="Aptos" w:hAnsi="Aptos"/>
+          <w:b/>
+          <w:bCs/>
+          <w:color w:val="000000"/>
+        </w:rPr>
+      </w:pPr>
+    </w:p>
+    <w:p>
+      <w:pPr>
+        <w:rPr>
+          <w:rFonts w:ascii="Aptos" w:hAnsi="Aptos"/>
+          <w:b/>
+          <w:bCs/>
+          <w:color w:val="000000"/>
+        </w:rPr>
+      </w:pPr>
+      <w:r>
+        <w:rPr>
+          <w:rFonts w:ascii="Aptos" w:hAnsi="Aptos"/>
+          <w:b/>
+          <w:bCs/>
+          <w:color w:val="000000"/>
+        </w:rPr>
+        <w:t>ML Development Approach</w:t>
+      </w:r>
+    </w:p>
+    <w:p>
+      <w:pPr>
+        <w:pStyle w:val="ListParagraph"/>
+        <w:numPr>
+          <w:ilvl w:val="0"/>
+          <w:numId w:val="7"/>
+        </w:numPr>
+        <w:rPr>
+          <w:rFonts w:ascii="Aptos" w:hAnsi="Aptos"/>
+          <w:b/>
+          <w:bCs/>
+          <w:color w:val="000000"/>
+        </w:rPr>
+      </w:pPr>
+      <w:r>
+        <w:rPr>
+          <w:rFonts w:ascii="Aptos" w:hAnsi="Aptos"/>
+          <w:color w:val="000000"/>
+        </w:rPr>
+        <w:t>Research:</w:t>
+      </w:r>
+    </w:p>
+    <w:p>
+      <w:pPr>
+        <w:pStyle w:val="ListParagraph"/>
+        <w:numPr>
+          <w:ilvl w:val="1"/>
+          <w:numId w:val="7"/>
+        </w:numPr>
+        <w:rPr>
+          <w:rFonts w:ascii="Aptos" w:hAnsi="Aptos"/>
+          <w:b/>
+          <w:bCs/>
+          <w:color w:val="000000"/>
+        </w:rPr>
+      </w:pPr>
+      <w:r>
+        <w:rPr>
+          <w:rFonts w:ascii="Aptos" w:hAnsi="Aptos"/>
+          <w:color w:val="000000"/>
+        </w:rPr>
+        <w:t xml:space="preserve">Existing solutions </w:t>
+      </w:r>
+    </w:p>
+    <w:p>
+      <w:pPr>
+        <w:pStyle w:val="ListParagraph"/>
+        <w:numPr>
+          <w:ilvl w:val="1"/>
+          <w:numId w:val="7"/>
+        </w:numPr>
+        <w:rPr>
+          <w:rFonts w:ascii="Aptos" w:hAnsi="Aptos"/>
+          <w:b/>
+          <w:bCs/>
+          <w:color w:val="000000"/>
+        </w:rPr>
+      </w:pPr>
+      <w:r>
+        <w:rPr>
+          <w:rFonts w:ascii="Aptos" w:hAnsi="Aptos"/>
+          <w:color w:val="000000"/>
+        </w:rPr>
+        <w:t xml:space="preserve">Similar studies </w:t>
+      </w:r>
+    </w:p>
+    <w:p>
+      <w:pPr>
+        <w:pStyle w:val="ListParagraph"/>
+        <w:numPr>
+          <w:ilvl w:val="1"/>
+          <w:numId w:val="7"/>
+        </w:numPr>
+        <w:rPr>
+          <w:rFonts w:ascii="Aptos" w:hAnsi="Aptos"/>
+          <w:color w:val="000000"/>
+        </w:rPr>
+      </w:pPr>
+      <w:r>
+        <w:rPr>
+          <w:rFonts w:ascii="Aptos" w:hAnsi="Aptos"/>
+          <w:color w:val="000000"/>
+        </w:rPr>
+        <w:t>Practical machine learning techniques for edge devices</w:t>
+      </w:r>
+    </w:p>
+    <w:p>
+      <w:pPr>
+        <w:pStyle w:val="ListParagraph"/>
+        <w:numPr>
+          <w:ilvl w:val="0"/>
+          <w:numId w:val="7"/>
+        </w:numPr>
+        <w:rPr>
+          <w:rFonts w:ascii="Aptos" w:hAnsi="Aptos"/>
+          <w:b/>
+          <w:bCs/>
+          <w:color w:val="000000"/>
+        </w:rPr>
+      </w:pPr>
+      <w:r>
+        <w:rPr>
+          <w:rFonts w:ascii="Aptos" w:hAnsi="Aptos"/>
+          <w:color w:val="000000"/>
+        </w:rPr>
+        <w:lastRenderedPageBreak/>
+        <w:t>Develop:</w:t>
+      </w:r>
+    </w:p>
+    <w:p>
+      <w:pPr>
+        <w:pStyle w:val="ListParagraph"/>
+        <w:numPr>
+          <w:ilvl w:val="1"/>
+          <w:numId w:val="7"/>
+        </w:numPr>
+        <w:spacing w:after="0" w:line="240" w:lineRule="auto"/>
+        <w:rPr>
+          <w:rFonts w:eastAsia="Times New Roman" w:cs="Times New Roman"/>
+          <w:kern w:val="0"/>
+          <w:lang w:eastAsia="en-IN"/>
+          <w14:ligatures w14:val="none"/>
+        </w:rPr>
+      </w:pPr>
+      <w:r>
+        <w:rPr>
+          <w:rFonts w:eastAsia="Times New Roman" w:cs="Times New Roman"/>
+          <w:kern w:val="0"/>
+          <w:lang w:eastAsia="en-IN"/>
+          <w14:ligatures w14:val="none"/>
+        </w:rPr>
+        <w:t>An initial ML model</w:t>
+      </w:r>
+    </w:p>
+    <w:p>
+      <w:pPr>
+        <w:pStyle w:val="ListParagraph"/>
+        <w:numPr>
+          <w:ilvl w:val="1"/>
+          <w:numId w:val="7"/>
+        </w:numPr>
+        <w:spacing w:after="0" w:line="240" w:lineRule="auto"/>
+        <w:rPr>
+          <w:rFonts w:eastAsia="Times New Roman" w:cs="Times New Roman"/>
+          <w:kern w:val="0"/>
+          <w:lang w:eastAsia="en-IN"/>
+          <w14:ligatures w14:val="none"/>
+        </w:rPr>
+      </w:pPr>
+      <w:r>
+        <w:rPr>
+          <w:rFonts w:eastAsia="Times New Roman" w:cs="Times New Roman"/>
+          <w:kern w:val="0"/>
+          <w:lang w:eastAsia="en-IN"/>
+          <w14:ligatures w14:val="none"/>
+        </w:rPr>
+        <w:t>Verify its functionality.</w:t>
+      </w:r>
+    </w:p>
+    <w:p>
+      <w:pPr>
+        <w:pStyle w:val="NormalWeb"/>
+        <w:numPr>
+          <w:ilvl w:val="0"/>
+          <w:numId w:val="7"/>
+        </w:numPr>
+      </w:pPr>
+      <w:r>
+        <w:t>Improve only if required after evaluation.</w:t>
+      </w:r>
+    </w:p>
+    <w:p>
+      <w:pPr>
+        <w:pStyle w:val="NormalWeb"/>
+        <w:ind w:left="360"/>
+      </w:pPr>
+    </w:p>
+    <w:p>
+      <w:pPr>
+        <w:pStyle w:val="NormalWeb"/>
+        <w:rPr>
+          <w:rFonts w:asciiTheme="minorHAnsi" w:hAnsiTheme="minorHAnsi"/>
+        </w:rPr>
+      </w:pPr>
+      <w:r>
+        <w:rPr>
+          <w:rFonts w:asciiTheme="minorHAnsi" w:hAnsiTheme="minorHAnsi"/>
+        </w:rPr>
+        <w:t>Overall</w:t>
+      </w:r>
+      <w:r>
+        <w:rPr>
+          <w:rFonts w:asciiTheme="minorHAnsi" w:hAnsiTheme="minorHAnsi"/>
+        </w:rPr>
+        <w:t>,</w:t>
+      </w:r>
+      <w:r>
+        <w:rPr>
+          <w:rFonts w:asciiTheme="minorHAnsi" w:hAnsiTheme="minorHAnsi"/>
+        </w:rPr>
+        <w:t xml:space="preserve"> </w:t>
+      </w:r>
+      <w:r>
+        <w:rPr>
+          <w:rFonts w:asciiTheme="minorHAnsi" w:hAnsiTheme="minorHAnsi"/>
+        </w:rPr>
+        <w:t>t</w:t>
+      </w:r>
+      <w:r>
+        <w:rPr>
+          <w:rFonts w:asciiTheme="minorHAnsi" w:hAnsiTheme="minorHAnsi"/>
+        </w:rPr>
+        <w:t xml:space="preserve">he supervisor emphasized during the discussion how crucial it is to further reduce the project's scope </w:t>
+      </w:r>
+      <w:r>
+        <w:rPr>
+          <w:rFonts w:asciiTheme="minorHAnsi" w:hAnsiTheme="minorHAnsi"/>
+        </w:rPr>
+        <w:t>to</w:t>
+      </w:r>
+      <w:r>
+        <w:rPr>
+          <w:rFonts w:asciiTheme="minorHAnsi" w:hAnsiTheme="minorHAnsi"/>
+        </w:rPr>
+        <w:t xml:space="preserve"> keep it feasible and focused. A single principal use case, the precise measurements to be taken, and a constrained machine learning scope appropriate for microcontroller execution were all described. To prevent scope creep, the supervisor suggested outlining exactly what the system will accomplish and, conversely, what it will not try to address. It was emphasized that the final submission should be consistent with the original proposal, show iterative development from the original concept, and contain a critical assessment of design choices, trade-offs, and limits. Throughout development, professional decision-making, reflective practice, and problem-solving should be reflected in the project documentation and weekly logs.</w:t>
+      </w:r>
+    </w:p>
+    <w:p>
+      <w:pPr>
+        <w:pStyle w:val="NormalWeb"/>
+      </w:pPr>
+      <w:r>
+        <w:t>`</w:t>
+      </w:r>
+    </w:p>
+    <w:p>
+      <w:pPr>
+        <w:rPr>
+          <w:rFonts w:ascii="Aptos" w:hAnsi="Aptos"/>
+          <w:b/>
+          <w:bCs/>
+          <w:color w:val="000000"/>
+        </w:rPr>
+      </w:pPr>
+    </w:p>
     <w:sectPr>
       <w:pgSz w:w="11906" w:h="16838"/>
       <w:pgMar w:top="1440" w:right="1440" w:bottom="1440" w:left="1440" w:header="708" w:footer="708" w:gutter="0"/>
@@ -2587,6 +3451,155 @@
 <file path=word/numbering.xml><?xml version="1.0" encoding="utf-8"?>
 <w:numbering xmlns:wpc="http://schemas.microsoft.com/office/word/2010/wordprocessingCanvas" xmlns:cx="http://schemas.microsoft.com/office/drawing/2014/chartex" xmlns:cx1="http://schemas.microsoft.com/office/drawing/2015/9/8/chartex" xmlns:cx2="http://schemas.microsoft.com/office/drawing/2015/10/21/chartex" xmlns:cx3="http://schemas.microsoft.com/office/drawing/2016/5/9/chartex" xmlns:cx4="http://schemas.microsoft.com/office/drawing/2016/5/10/chartex" xmlns:cx5="http://schemas.microsoft.com/office/drawing/2016/5/11/chartex" xmlns:cx6="http://schemas.microsoft.com/office/drawing/2016/5/12/chartex" xmlns:cx7="http://schemas.microsoft.com/office/drawing/2016/5/13/chartex" xmlns:cx8="http://schemas.microsoft.com/office/drawing/2016/5/14/chartex" xmlns:mc="http://schemas.openxmlformats.org/markup-compatibility/2006" xmlns:aink="http://schemas.microsoft.com/office/drawing/2016/ink" xmlns:am3d="http://schemas.microsoft.com/office/drawing/2017/model3d" xmlns:o="urn:schemas-microsoft-com:office:office" xmlns:oel="http://schemas.microsoft.com/office/2019/extlst" xmlns:r="http://schemas.openxmlformats.org/officeDocument/2006/relationships" xmlns:m="http://schemas.openxmlformats.org/officeDocument/2006/math" xmlns:v="urn:schemas-microsoft-com:vml" xmlns:wp14="http://schemas.microsoft.com/office/word/2010/wordprocessingDrawing" xmlns:wp="http://schemas.openxmlformats.org/drawingml/2006/wordprocessingDrawing" xmlns:w10="urn:schemas-microsoft-com:office:word" xmlns:w="http://schemas.openxmlformats.org/wordprocessingml/2006/main" xmlns:w14="http://schemas.microsoft.com/office/word/2010/wordml" xmlns:w15="http://schemas.microsoft.com/office/word/2012/wordml" xmlns:w16cex="http://schemas.microsoft.com/office/word/2018/wordml/cex" xmlns:w16cid="http://schemas.microsoft.com/office/word/2016/wordml/cid" xmlns:w16="http://schemas.microsoft.com/office/word/2018/wordml" xmlns:w16du="http://schemas.microsoft.com/office/word/2023/wordml/word16du" xmlns:w16sdtdh="http://schemas.microsoft.com/office/word/2020/wordml/sdtdatahash" xmlns:w16sdtfl="http://schemas.microsoft.com/office/word/2024/wordml/sdtformatlock" xmlns:w16se="http://schemas.microsoft.com/office/word/2015/wordml/symex" xmlns:wpg="http://schemas.microsoft.com/office/word/2010/wordprocessingGroup" xmlns:wpi="http://schemas.microsoft.com/office/word/2010/wordprocessingInk" xmlns:wne="http://schemas.microsoft.com/office/word/2006/wordml" xmlns:wps="http://schemas.microsoft.com/office/word/2010/wordprocessingShape" mc:Ignorable="w14 w15 w16se w16cid w16 w16cex w16sdtdh w16sdtfl w16du wp14">
   <w:abstractNum w:abstractNumId="0" w15:restartNumberingAfterBreak="0">
+    <w:nsid w:val="00A15EA3"/>
+    <w:multiLevelType w:val="multilevel"/>
+    <w:tmpl w:val="C0AC02F4"/>
+    <w:lvl w:ilvl="0">
+      <w:start w:val="1"/>
+      <w:numFmt w:val="bullet"/>
+      <w:lvlText w:val=""/>
+      <w:lvlJc w:val="left"/>
+      <w:pPr>
+        <w:tabs>
+          <w:tab w:val="num" w:pos="720"/>
+        </w:tabs>
+        <w:ind w:left="720" w:hanging="360"/>
+      </w:pPr>
+      <w:rPr>
+        <w:rFonts w:ascii="Symbol" w:hAnsi="Symbol" w:hint="default"/>
+        <w:sz w:val="20"/>
+      </w:rPr>
+    </w:lvl>
+    <w:lvl w:ilvl="1" w:tentative="1">
+      <w:start w:val="1"/>
+      <w:numFmt w:val="bullet"/>
+      <w:lvlText w:val="o"/>
+      <w:lvlJc w:val="left"/>
+      <w:pPr>
+        <w:tabs>
+          <w:tab w:val="num" w:pos="1440"/>
+        </w:tabs>
+        <w:ind w:left="1440" w:hanging="360"/>
+      </w:pPr>
+      <w:rPr>
+        <w:rFonts w:ascii="Courier New" w:hAnsi="Courier New" w:hint="default"/>
+        <w:sz w:val="20"/>
+      </w:rPr>
+    </w:lvl>
+    <w:lvl w:ilvl="2" w:tentative="1">
+      <w:start w:val="1"/>
+      <w:numFmt w:val="bullet"/>
+      <w:lvlText w:val=""/>
+      <w:lvlJc w:val="left"/>
+      <w:pPr>
+        <w:tabs>
+          <w:tab w:val="num" w:pos="2160"/>
+        </w:tabs>
+        <w:ind w:left="2160" w:hanging="360"/>
+      </w:pPr>
+      <w:rPr>
+        <w:rFonts w:ascii="Wingdings" w:hAnsi="Wingdings" w:hint="default"/>
+        <w:sz w:val="20"/>
+      </w:rPr>
+    </w:lvl>
+    <w:lvl w:ilvl="3" w:tentative="1">
+      <w:start w:val="1"/>
+      <w:numFmt w:val="bullet"/>
+      <w:lvlText w:val=""/>
+      <w:lvlJc w:val="left"/>
+      <w:pPr>
+        <w:tabs>
+          <w:tab w:val="num" w:pos="2880"/>
+        </w:tabs>
+        <w:ind w:left="2880" w:hanging="360"/>
+      </w:pPr>
+      <w:rPr>
+        <w:rFonts w:ascii="Wingdings" w:hAnsi="Wingdings" w:hint="default"/>
+        <w:sz w:val="20"/>
+      </w:rPr>
+    </w:lvl>
+    <w:lvl w:ilvl="4" w:tentative="1">
+      <w:start w:val="1"/>
+      <w:numFmt w:val="bullet"/>
+      <w:lvlText w:val=""/>
+      <w:lvlJc w:val="left"/>
+      <w:pPr>
+        <w:tabs>
+          <w:tab w:val="num" w:pos="3600"/>
+        </w:tabs>
+        <w:ind w:left="3600" w:hanging="360"/>
+      </w:pPr>
+      <w:rPr>
+        <w:rFonts w:ascii="Wingdings" w:hAnsi="Wingdings" w:hint="default"/>
+        <w:sz w:val="20"/>
+      </w:rPr>
+    </w:lvl>
+    <w:lvl w:ilvl="5" w:tentative="1">
+      <w:start w:val="1"/>
+      <w:numFmt w:val="bullet"/>
+      <w:lvlText w:val=""/>
+      <w:lvlJc w:val="left"/>
+      <w:pPr>
+        <w:tabs>
+          <w:tab w:val="num" w:pos="4320"/>
+        </w:tabs>
+        <w:ind w:left="4320" w:hanging="360"/>
+      </w:pPr>
+      <w:rPr>
+        <w:rFonts w:ascii="Wingdings" w:hAnsi="Wingdings" w:hint="default"/>
+        <w:sz w:val="20"/>
+      </w:rPr>
+    </w:lvl>
+    <w:lvl w:ilvl="6" w:tentative="1">
+      <w:start w:val="1"/>
+      <w:numFmt w:val="bullet"/>
+      <w:lvlText w:val=""/>
+      <w:lvlJc w:val="left"/>
+      <w:pPr>
+        <w:tabs>
+          <w:tab w:val="num" w:pos="5040"/>
+        </w:tabs>
+        <w:ind w:left="5040" w:hanging="360"/>
+      </w:pPr>
+      <w:rPr>
+        <w:rFonts w:ascii="Wingdings" w:hAnsi="Wingdings" w:hint="default"/>
+        <w:sz w:val="20"/>
+      </w:rPr>
+    </w:lvl>
+    <w:lvl w:ilvl="7" w:tentative="1">
+      <w:start w:val="1"/>
+      <w:numFmt w:val="bullet"/>
+      <w:lvlText w:val=""/>
+      <w:lvlJc w:val="left"/>
+      <w:pPr>
+        <w:tabs>
+          <w:tab w:val="num" w:pos="5760"/>
+        </w:tabs>
+        <w:ind w:left="5760" w:hanging="360"/>
+      </w:pPr>
+      <w:rPr>
+        <w:rFonts w:ascii="Wingdings" w:hAnsi="Wingdings" w:hint="default"/>
+        <w:sz w:val="20"/>
+      </w:rPr>
+    </w:lvl>
+    <w:lvl w:ilvl="8" w:tentative="1">
+      <w:start w:val="1"/>
+      <w:numFmt w:val="bullet"/>
+      <w:lvlText w:val=""/>
+      <w:lvlJc w:val="left"/>
+      <w:pPr>
+        <w:tabs>
+          <w:tab w:val="num" w:pos="6480"/>
+        </w:tabs>
+        <w:ind w:left="6480" w:hanging="360"/>
+      </w:pPr>
+      <w:rPr>
+        <w:rFonts w:ascii="Wingdings" w:hAnsi="Wingdings" w:hint="default"/>
+        <w:sz w:val="20"/>
+      </w:rPr>
+    </w:lvl>
+  </w:abstractNum>
+  <w:abstractNum w:abstractNumId="1" w15:restartNumberingAfterBreak="0">
     <w:nsid w:val="0CF667C9"/>
     <w:multiLevelType w:val="hybridMultilevel"/>
     <w:tmpl w:val="D1147FC4"/>
@@ -2699,7 +3712,120 @@
       </w:rPr>
     </w:lvl>
   </w:abstractNum>
-  <w:abstractNum w:abstractNumId="1" w15:restartNumberingAfterBreak="0">
+  <w:abstractNum w:abstractNumId="2" w15:restartNumberingAfterBreak="0">
+    <w:nsid w:val="352A3D82"/>
+    <w:multiLevelType w:val="hybridMultilevel"/>
+    <w:tmpl w:val="B2EA3C2E"/>
+    <w:lvl w:ilvl="0" w:tplc="40090001">
+      <w:start w:val="1"/>
+      <w:numFmt w:val="bullet"/>
+      <w:lvlText w:val=""/>
+      <w:lvlJc w:val="left"/>
+      <w:pPr>
+        <w:ind w:left="720" w:hanging="360"/>
+      </w:pPr>
+      <w:rPr>
+        <w:rFonts w:ascii="Symbol" w:hAnsi="Symbol" w:hint="default"/>
+      </w:rPr>
+    </w:lvl>
+    <w:lvl w:ilvl="1" w:tplc="40090003">
+      <w:start w:val="1"/>
+      <w:numFmt w:val="bullet"/>
+      <w:lvlText w:val="o"/>
+      <w:lvlJc w:val="left"/>
+      <w:pPr>
+        <w:ind w:left="1440" w:hanging="360"/>
+      </w:pPr>
+      <w:rPr>
+        <w:rFonts w:ascii="Courier New" w:hAnsi="Courier New" w:cs="Courier New" w:hint="default"/>
+      </w:rPr>
+    </w:lvl>
+    <w:lvl w:ilvl="2" w:tplc="40090005" w:tentative="1">
+      <w:start w:val="1"/>
+      <w:numFmt w:val="bullet"/>
+      <w:lvlText w:val=""/>
+      <w:lvlJc w:val="left"/>
+      <w:pPr>
+        <w:ind w:left="2160" w:hanging="360"/>
+      </w:pPr>
+      <w:rPr>
+        <w:rFonts w:ascii="Wingdings" w:hAnsi="Wingdings" w:hint="default"/>
+      </w:rPr>
+    </w:lvl>
+    <w:lvl w:ilvl="3" w:tplc="40090001" w:tentative="1">
+      <w:start w:val="1"/>
+      <w:numFmt w:val="bullet"/>
+      <w:lvlText w:val=""/>
+      <w:lvlJc w:val="left"/>
+      <w:pPr>
+        <w:ind w:left="2880" w:hanging="360"/>
+      </w:pPr>
+      <w:rPr>
+        <w:rFonts w:ascii="Symbol" w:hAnsi="Symbol" w:hint="default"/>
+      </w:rPr>
+    </w:lvl>
+    <w:lvl w:ilvl="4" w:tplc="40090003" w:tentative="1">
+      <w:start w:val="1"/>
+      <w:numFmt w:val="bullet"/>
+      <w:lvlText w:val="o"/>
+      <w:lvlJc w:val="left"/>
+      <w:pPr>
+        <w:ind w:left="3600" w:hanging="360"/>
+      </w:pPr>
+      <w:rPr>
+        <w:rFonts w:ascii="Courier New" w:hAnsi="Courier New" w:cs="Courier New" w:hint="default"/>
+      </w:rPr>
+    </w:lvl>
+    <w:lvl w:ilvl="5" w:tplc="40090005" w:tentative="1">
+      <w:start w:val="1"/>
+      <w:numFmt w:val="bullet"/>
+      <w:lvlText w:val=""/>
+      <w:lvlJc w:val="left"/>
+      <w:pPr>
+        <w:ind w:left="4320" w:hanging="360"/>
+      </w:pPr>
+      <w:rPr>
+        <w:rFonts w:ascii="Wingdings" w:hAnsi="Wingdings" w:hint="default"/>
+      </w:rPr>
+    </w:lvl>
+    <w:lvl w:ilvl="6" w:tplc="40090001" w:tentative="1">
+      <w:start w:val="1"/>
+      <w:numFmt w:val="bullet"/>
+      <w:lvlText w:val=""/>
+      <w:lvlJc w:val="left"/>
+      <w:pPr>
+        <w:ind w:left="5040" w:hanging="360"/>
+      </w:pPr>
+      <w:rPr>
+        <w:rFonts w:ascii="Symbol" w:hAnsi="Symbol" w:hint="default"/>
+      </w:rPr>
+    </w:lvl>
+    <w:lvl w:ilvl="7" w:tplc="40090003" w:tentative="1">
+      <w:start w:val="1"/>
+      <w:numFmt w:val="bullet"/>
+      <w:lvlText w:val="o"/>
+      <w:lvlJc w:val="left"/>
+      <w:pPr>
+        <w:ind w:left="5760" w:hanging="360"/>
+      </w:pPr>
+      <w:rPr>
+        <w:rFonts w:ascii="Courier New" w:hAnsi="Courier New" w:cs="Courier New" w:hint="default"/>
+      </w:rPr>
+    </w:lvl>
+    <w:lvl w:ilvl="8" w:tplc="40090005" w:tentative="1">
+      <w:start w:val="1"/>
+      <w:numFmt w:val="bullet"/>
+      <w:lvlText w:val=""/>
+      <w:lvlJc w:val="left"/>
+      <w:pPr>
+        <w:ind w:left="6480" w:hanging="360"/>
+      </w:pPr>
+      <w:rPr>
+        <w:rFonts w:ascii="Wingdings" w:hAnsi="Wingdings" w:hint="default"/>
+      </w:rPr>
+    </w:lvl>
+  </w:abstractNum>
+  <w:abstractNum w:abstractNumId="3" w15:restartNumberingAfterBreak="0">
     <w:nsid w:val="37AA3D63"/>
     <w:multiLevelType w:val="hybridMultilevel"/>
     <w:tmpl w:val="A4BA1FC2"/>
@@ -2812,11 +3938,597 @@
       </w:rPr>
     </w:lvl>
   </w:abstractNum>
+  <w:abstractNum w:abstractNumId="4" w15:restartNumberingAfterBreak="0">
+    <w:nsid w:val="3C862EA8"/>
+    <w:multiLevelType w:val="hybridMultilevel"/>
+    <w:tmpl w:val="A5FA18E2"/>
+    <w:lvl w:ilvl="0" w:tplc="40090001">
+      <w:start w:val="1"/>
+      <w:numFmt w:val="bullet"/>
+      <w:lvlText w:val=""/>
+      <w:lvlJc w:val="left"/>
+      <w:pPr>
+        <w:ind w:left="720" w:hanging="360"/>
+      </w:pPr>
+      <w:rPr>
+        <w:rFonts w:ascii="Symbol" w:hAnsi="Symbol" w:hint="default"/>
+      </w:rPr>
+    </w:lvl>
+    <w:lvl w:ilvl="1" w:tplc="40090003">
+      <w:start w:val="1"/>
+      <w:numFmt w:val="bullet"/>
+      <w:lvlText w:val="o"/>
+      <w:lvlJc w:val="left"/>
+      <w:pPr>
+        <w:ind w:left="1440" w:hanging="360"/>
+      </w:pPr>
+      <w:rPr>
+        <w:rFonts w:ascii="Courier New" w:hAnsi="Courier New" w:cs="Courier New" w:hint="default"/>
+      </w:rPr>
+    </w:lvl>
+    <w:lvl w:ilvl="2" w:tplc="40090005" w:tentative="1">
+      <w:start w:val="1"/>
+      <w:numFmt w:val="bullet"/>
+      <w:lvlText w:val=""/>
+      <w:lvlJc w:val="left"/>
+      <w:pPr>
+        <w:ind w:left="2160" w:hanging="360"/>
+      </w:pPr>
+      <w:rPr>
+        <w:rFonts w:ascii="Wingdings" w:hAnsi="Wingdings" w:hint="default"/>
+      </w:rPr>
+    </w:lvl>
+    <w:lvl w:ilvl="3" w:tplc="40090001" w:tentative="1">
+      <w:start w:val="1"/>
+      <w:numFmt w:val="bullet"/>
+      <w:lvlText w:val=""/>
+      <w:lvlJc w:val="left"/>
+      <w:pPr>
+        <w:ind w:left="2880" w:hanging="360"/>
+      </w:pPr>
+      <w:rPr>
+        <w:rFonts w:ascii="Symbol" w:hAnsi="Symbol" w:hint="default"/>
+      </w:rPr>
+    </w:lvl>
+    <w:lvl w:ilvl="4" w:tplc="40090003" w:tentative="1">
+      <w:start w:val="1"/>
+      <w:numFmt w:val="bullet"/>
+      <w:lvlText w:val="o"/>
+      <w:lvlJc w:val="left"/>
+      <w:pPr>
+        <w:ind w:left="3600" w:hanging="360"/>
+      </w:pPr>
+      <w:rPr>
+        <w:rFonts w:ascii="Courier New" w:hAnsi="Courier New" w:cs="Courier New" w:hint="default"/>
+      </w:rPr>
+    </w:lvl>
+    <w:lvl w:ilvl="5" w:tplc="40090005" w:tentative="1">
+      <w:start w:val="1"/>
+      <w:numFmt w:val="bullet"/>
+      <w:lvlText w:val=""/>
+      <w:lvlJc w:val="left"/>
+      <w:pPr>
+        <w:ind w:left="4320" w:hanging="360"/>
+      </w:pPr>
+      <w:rPr>
+        <w:rFonts w:ascii="Wingdings" w:hAnsi="Wingdings" w:hint="default"/>
+      </w:rPr>
+    </w:lvl>
+    <w:lvl w:ilvl="6" w:tplc="40090001" w:tentative="1">
+      <w:start w:val="1"/>
+      <w:numFmt w:val="bullet"/>
+      <w:lvlText w:val=""/>
+      <w:lvlJc w:val="left"/>
+      <w:pPr>
+        <w:ind w:left="5040" w:hanging="360"/>
+      </w:pPr>
+      <w:rPr>
+        <w:rFonts w:ascii="Symbol" w:hAnsi="Symbol" w:hint="default"/>
+      </w:rPr>
+    </w:lvl>
+    <w:lvl w:ilvl="7" w:tplc="40090003" w:tentative="1">
+      <w:start w:val="1"/>
+      <w:numFmt w:val="bullet"/>
+      <w:lvlText w:val="o"/>
+      <w:lvlJc w:val="left"/>
+      <w:pPr>
+        <w:ind w:left="5760" w:hanging="360"/>
+      </w:pPr>
+      <w:rPr>
+        <w:rFonts w:ascii="Courier New" w:hAnsi="Courier New" w:cs="Courier New" w:hint="default"/>
+      </w:rPr>
+    </w:lvl>
+    <w:lvl w:ilvl="8" w:tplc="40090005" w:tentative="1">
+      <w:start w:val="1"/>
+      <w:numFmt w:val="bullet"/>
+      <w:lvlText w:val=""/>
+      <w:lvlJc w:val="left"/>
+      <w:pPr>
+        <w:ind w:left="6480" w:hanging="360"/>
+      </w:pPr>
+      <w:rPr>
+        <w:rFonts w:ascii="Wingdings" w:hAnsi="Wingdings" w:hint="default"/>
+      </w:rPr>
+    </w:lvl>
+  </w:abstractNum>
+  <w:abstractNum w:abstractNumId="5" w15:restartNumberingAfterBreak="0">
+    <w:nsid w:val="3D924276"/>
+    <w:multiLevelType w:val="hybridMultilevel"/>
+    <w:tmpl w:val="D5DCD024"/>
+    <w:lvl w:ilvl="0" w:tplc="40090001">
+      <w:start w:val="1"/>
+      <w:numFmt w:val="bullet"/>
+      <w:lvlText w:val=""/>
+      <w:lvlJc w:val="left"/>
+      <w:pPr>
+        <w:ind w:left="720" w:hanging="360"/>
+      </w:pPr>
+      <w:rPr>
+        <w:rFonts w:ascii="Symbol" w:hAnsi="Symbol" w:hint="default"/>
+      </w:rPr>
+    </w:lvl>
+    <w:lvl w:ilvl="1" w:tplc="40090003" w:tentative="1">
+      <w:start w:val="1"/>
+      <w:numFmt w:val="bullet"/>
+      <w:lvlText w:val="o"/>
+      <w:lvlJc w:val="left"/>
+      <w:pPr>
+        <w:ind w:left="1440" w:hanging="360"/>
+      </w:pPr>
+      <w:rPr>
+        <w:rFonts w:ascii="Courier New" w:hAnsi="Courier New" w:cs="Courier New" w:hint="default"/>
+      </w:rPr>
+    </w:lvl>
+    <w:lvl w:ilvl="2" w:tplc="40090005" w:tentative="1">
+      <w:start w:val="1"/>
+      <w:numFmt w:val="bullet"/>
+      <w:lvlText w:val=""/>
+      <w:lvlJc w:val="left"/>
+      <w:pPr>
+        <w:ind w:left="2160" w:hanging="360"/>
+      </w:pPr>
+      <w:rPr>
+        <w:rFonts w:ascii="Wingdings" w:hAnsi="Wingdings" w:hint="default"/>
+      </w:rPr>
+    </w:lvl>
+    <w:lvl w:ilvl="3" w:tplc="40090001" w:tentative="1">
+      <w:start w:val="1"/>
+      <w:numFmt w:val="bullet"/>
+      <w:lvlText w:val=""/>
+      <w:lvlJc w:val="left"/>
+      <w:pPr>
+        <w:ind w:left="2880" w:hanging="360"/>
+      </w:pPr>
+      <w:rPr>
+        <w:rFonts w:ascii="Symbol" w:hAnsi="Symbol" w:hint="default"/>
+      </w:rPr>
+    </w:lvl>
+    <w:lvl w:ilvl="4" w:tplc="40090003" w:tentative="1">
+      <w:start w:val="1"/>
+      <w:numFmt w:val="bullet"/>
+      <w:lvlText w:val="o"/>
+      <w:lvlJc w:val="left"/>
+      <w:pPr>
+        <w:ind w:left="3600" w:hanging="360"/>
+      </w:pPr>
+      <w:rPr>
+        <w:rFonts w:ascii="Courier New" w:hAnsi="Courier New" w:cs="Courier New" w:hint="default"/>
+      </w:rPr>
+    </w:lvl>
+    <w:lvl w:ilvl="5" w:tplc="40090005" w:tentative="1">
+      <w:start w:val="1"/>
+      <w:numFmt w:val="bullet"/>
+      <w:lvlText w:val=""/>
+      <w:lvlJc w:val="left"/>
+      <w:pPr>
+        <w:ind w:left="4320" w:hanging="360"/>
+      </w:pPr>
+      <w:rPr>
+        <w:rFonts w:ascii="Wingdings" w:hAnsi="Wingdings" w:hint="default"/>
+      </w:rPr>
+    </w:lvl>
+    <w:lvl w:ilvl="6" w:tplc="40090001" w:tentative="1">
+      <w:start w:val="1"/>
+      <w:numFmt w:val="bullet"/>
+      <w:lvlText w:val=""/>
+      <w:lvlJc w:val="left"/>
+      <w:pPr>
+        <w:ind w:left="5040" w:hanging="360"/>
+      </w:pPr>
+      <w:rPr>
+        <w:rFonts w:ascii="Symbol" w:hAnsi="Symbol" w:hint="default"/>
+      </w:rPr>
+    </w:lvl>
+    <w:lvl w:ilvl="7" w:tplc="40090003" w:tentative="1">
+      <w:start w:val="1"/>
+      <w:numFmt w:val="bullet"/>
+      <w:lvlText w:val="o"/>
+      <w:lvlJc w:val="left"/>
+      <w:pPr>
+        <w:ind w:left="5760" w:hanging="360"/>
+      </w:pPr>
+      <w:rPr>
+        <w:rFonts w:ascii="Courier New" w:hAnsi="Courier New" w:cs="Courier New" w:hint="default"/>
+      </w:rPr>
+    </w:lvl>
+    <w:lvl w:ilvl="8" w:tplc="40090005" w:tentative="1">
+      <w:start w:val="1"/>
+      <w:numFmt w:val="bullet"/>
+      <w:lvlText w:val=""/>
+      <w:lvlJc w:val="left"/>
+      <w:pPr>
+        <w:ind w:left="6480" w:hanging="360"/>
+      </w:pPr>
+      <w:rPr>
+        <w:rFonts w:ascii="Wingdings" w:hAnsi="Wingdings" w:hint="default"/>
+      </w:rPr>
+    </w:lvl>
+  </w:abstractNum>
+  <w:abstractNum w:abstractNumId="6" w15:restartNumberingAfterBreak="0">
+    <w:nsid w:val="42BC5584"/>
+    <w:multiLevelType w:val="hybridMultilevel"/>
+    <w:tmpl w:val="6474327E"/>
+    <w:lvl w:ilvl="0" w:tplc="40090001">
+      <w:start w:val="1"/>
+      <w:numFmt w:val="bullet"/>
+      <w:lvlText w:val=""/>
+      <w:lvlJc w:val="left"/>
+      <w:pPr>
+        <w:ind w:left="720" w:hanging="360"/>
+      </w:pPr>
+      <w:rPr>
+        <w:rFonts w:ascii="Symbol" w:hAnsi="Symbol" w:hint="default"/>
+      </w:rPr>
+    </w:lvl>
+    <w:lvl w:ilvl="1" w:tplc="40090003">
+      <w:start w:val="1"/>
+      <w:numFmt w:val="bullet"/>
+      <w:lvlText w:val="o"/>
+      <w:lvlJc w:val="left"/>
+      <w:pPr>
+        <w:ind w:left="1440" w:hanging="360"/>
+      </w:pPr>
+      <w:rPr>
+        <w:rFonts w:ascii="Courier New" w:hAnsi="Courier New" w:cs="Courier New" w:hint="default"/>
+      </w:rPr>
+    </w:lvl>
+    <w:lvl w:ilvl="2" w:tplc="40090005">
+      <w:start w:val="1"/>
+      <w:numFmt w:val="bullet"/>
+      <w:lvlText w:val=""/>
+      <w:lvlJc w:val="left"/>
+      <w:pPr>
+        <w:ind w:left="2160" w:hanging="360"/>
+      </w:pPr>
+      <w:rPr>
+        <w:rFonts w:ascii="Wingdings" w:hAnsi="Wingdings" w:hint="default"/>
+      </w:rPr>
+    </w:lvl>
+    <w:lvl w:ilvl="3" w:tplc="40090001" w:tentative="1">
+      <w:start w:val="1"/>
+      <w:numFmt w:val="bullet"/>
+      <w:lvlText w:val=""/>
+      <w:lvlJc w:val="left"/>
+      <w:pPr>
+        <w:ind w:left="2880" w:hanging="360"/>
+      </w:pPr>
+      <w:rPr>
+        <w:rFonts w:ascii="Symbol" w:hAnsi="Symbol" w:hint="default"/>
+      </w:rPr>
+    </w:lvl>
+    <w:lvl w:ilvl="4" w:tplc="40090003" w:tentative="1">
+      <w:start w:val="1"/>
+      <w:numFmt w:val="bullet"/>
+      <w:lvlText w:val="o"/>
+      <w:lvlJc w:val="left"/>
+      <w:pPr>
+        <w:ind w:left="3600" w:hanging="360"/>
+      </w:pPr>
+      <w:rPr>
+        <w:rFonts w:ascii="Courier New" w:hAnsi="Courier New" w:cs="Courier New" w:hint="default"/>
+      </w:rPr>
+    </w:lvl>
+    <w:lvl w:ilvl="5" w:tplc="40090005" w:tentative="1">
+      <w:start w:val="1"/>
+      <w:numFmt w:val="bullet"/>
+      <w:lvlText w:val=""/>
+      <w:lvlJc w:val="left"/>
+      <w:pPr>
+        <w:ind w:left="4320" w:hanging="360"/>
+      </w:pPr>
+      <w:rPr>
+        <w:rFonts w:ascii="Wingdings" w:hAnsi="Wingdings" w:hint="default"/>
+      </w:rPr>
+    </w:lvl>
+    <w:lvl w:ilvl="6" w:tplc="40090001" w:tentative="1">
+      <w:start w:val="1"/>
+      <w:numFmt w:val="bullet"/>
+      <w:lvlText w:val=""/>
+      <w:lvlJc w:val="left"/>
+      <w:pPr>
+        <w:ind w:left="5040" w:hanging="360"/>
+      </w:pPr>
+      <w:rPr>
+        <w:rFonts w:ascii="Symbol" w:hAnsi="Symbol" w:hint="default"/>
+      </w:rPr>
+    </w:lvl>
+    <w:lvl w:ilvl="7" w:tplc="40090003" w:tentative="1">
+      <w:start w:val="1"/>
+      <w:numFmt w:val="bullet"/>
+      <w:lvlText w:val="o"/>
+      <w:lvlJc w:val="left"/>
+      <w:pPr>
+        <w:ind w:left="5760" w:hanging="360"/>
+      </w:pPr>
+      <w:rPr>
+        <w:rFonts w:ascii="Courier New" w:hAnsi="Courier New" w:cs="Courier New" w:hint="default"/>
+      </w:rPr>
+    </w:lvl>
+    <w:lvl w:ilvl="8" w:tplc="40090005" w:tentative="1">
+      <w:start w:val="1"/>
+      <w:numFmt w:val="bullet"/>
+      <w:lvlText w:val=""/>
+      <w:lvlJc w:val="left"/>
+      <w:pPr>
+        <w:ind w:left="6480" w:hanging="360"/>
+      </w:pPr>
+      <w:rPr>
+        <w:rFonts w:ascii="Wingdings" w:hAnsi="Wingdings" w:hint="default"/>
+      </w:rPr>
+    </w:lvl>
+  </w:abstractNum>
+  <w:abstractNum w:abstractNumId="7" w15:restartNumberingAfterBreak="0">
+    <w:nsid w:val="613458C0"/>
+    <w:multiLevelType w:val="hybridMultilevel"/>
+    <w:tmpl w:val="EB1AD932"/>
+    <w:lvl w:ilvl="0" w:tplc="40090001">
+      <w:start w:val="1"/>
+      <w:numFmt w:val="bullet"/>
+      <w:lvlText w:val=""/>
+      <w:lvlJc w:val="left"/>
+      <w:pPr>
+        <w:ind w:left="720" w:hanging="360"/>
+      </w:pPr>
+      <w:rPr>
+        <w:rFonts w:ascii="Symbol" w:hAnsi="Symbol" w:hint="default"/>
+      </w:rPr>
+    </w:lvl>
+    <w:lvl w:ilvl="1" w:tplc="40090003" w:tentative="1">
+      <w:start w:val="1"/>
+      <w:numFmt w:val="bullet"/>
+      <w:lvlText w:val="o"/>
+      <w:lvlJc w:val="left"/>
+      <w:pPr>
+        <w:ind w:left="1440" w:hanging="360"/>
+      </w:pPr>
+      <w:rPr>
+        <w:rFonts w:ascii="Courier New" w:hAnsi="Courier New" w:cs="Courier New" w:hint="default"/>
+      </w:rPr>
+    </w:lvl>
+    <w:lvl w:ilvl="2" w:tplc="40090005" w:tentative="1">
+      <w:start w:val="1"/>
+      <w:numFmt w:val="bullet"/>
+      <w:lvlText w:val=""/>
+      <w:lvlJc w:val="left"/>
+      <w:pPr>
+        <w:ind w:left="2160" w:hanging="360"/>
+      </w:pPr>
+      <w:rPr>
+        <w:rFonts w:ascii="Wingdings" w:hAnsi="Wingdings" w:hint="default"/>
+      </w:rPr>
+    </w:lvl>
+    <w:lvl w:ilvl="3" w:tplc="40090001" w:tentative="1">
+      <w:start w:val="1"/>
+      <w:numFmt w:val="bullet"/>
+      <w:lvlText w:val=""/>
+      <w:lvlJc w:val="left"/>
+      <w:pPr>
+        <w:ind w:left="2880" w:hanging="360"/>
+      </w:pPr>
+      <w:rPr>
+        <w:rFonts w:ascii="Symbol" w:hAnsi="Symbol" w:hint="default"/>
+      </w:rPr>
+    </w:lvl>
+    <w:lvl w:ilvl="4" w:tplc="40090003" w:tentative="1">
+      <w:start w:val="1"/>
+      <w:numFmt w:val="bullet"/>
+      <w:lvlText w:val="o"/>
+      <w:lvlJc w:val="left"/>
+      <w:pPr>
+        <w:ind w:left="3600" w:hanging="360"/>
+      </w:pPr>
+      <w:rPr>
+        <w:rFonts w:ascii="Courier New" w:hAnsi="Courier New" w:cs="Courier New" w:hint="default"/>
+      </w:rPr>
+    </w:lvl>
+    <w:lvl w:ilvl="5" w:tplc="40090005" w:tentative="1">
+      <w:start w:val="1"/>
+      <w:numFmt w:val="bullet"/>
+      <w:lvlText w:val=""/>
+      <w:lvlJc w:val="left"/>
+      <w:pPr>
+        <w:ind w:left="4320" w:hanging="360"/>
+      </w:pPr>
+      <w:rPr>
+        <w:rFonts w:ascii="Wingdings" w:hAnsi="Wingdings" w:hint="default"/>
+      </w:rPr>
+    </w:lvl>
+    <w:lvl w:ilvl="6" w:tplc="40090001" w:tentative="1">
+      <w:start w:val="1"/>
+      <w:numFmt w:val="bullet"/>
+      <w:lvlText w:val=""/>
+      <w:lvlJc w:val="left"/>
+      <w:pPr>
+        <w:ind w:left="5040" w:hanging="360"/>
+      </w:pPr>
+      <w:rPr>
+        <w:rFonts w:ascii="Symbol" w:hAnsi="Symbol" w:hint="default"/>
+      </w:rPr>
+    </w:lvl>
+    <w:lvl w:ilvl="7" w:tplc="40090003" w:tentative="1">
+      <w:start w:val="1"/>
+      <w:numFmt w:val="bullet"/>
+      <w:lvlText w:val="o"/>
+      <w:lvlJc w:val="left"/>
+      <w:pPr>
+        <w:ind w:left="5760" w:hanging="360"/>
+      </w:pPr>
+      <w:rPr>
+        <w:rFonts w:ascii="Courier New" w:hAnsi="Courier New" w:cs="Courier New" w:hint="default"/>
+      </w:rPr>
+    </w:lvl>
+    <w:lvl w:ilvl="8" w:tplc="40090005" w:tentative="1">
+      <w:start w:val="1"/>
+      <w:numFmt w:val="bullet"/>
+      <w:lvlText w:val=""/>
+      <w:lvlJc w:val="left"/>
+      <w:pPr>
+        <w:ind w:left="6480" w:hanging="360"/>
+      </w:pPr>
+      <w:rPr>
+        <w:rFonts w:ascii="Wingdings" w:hAnsi="Wingdings" w:hint="default"/>
+      </w:rPr>
+    </w:lvl>
+  </w:abstractNum>
+  <w:abstractNum w:abstractNumId="8" w15:restartNumberingAfterBreak="0">
+    <w:nsid w:val="6BB60245"/>
+    <w:multiLevelType w:val="hybridMultilevel"/>
+    <w:tmpl w:val="36F48E9C"/>
+    <w:lvl w:ilvl="0" w:tplc="40090001">
+      <w:start w:val="1"/>
+      <w:numFmt w:val="bullet"/>
+      <w:lvlText w:val=""/>
+      <w:lvlJc w:val="left"/>
+      <w:pPr>
+        <w:ind w:left="720" w:hanging="360"/>
+      </w:pPr>
+      <w:rPr>
+        <w:rFonts w:ascii="Symbol" w:hAnsi="Symbol" w:hint="default"/>
+      </w:rPr>
+    </w:lvl>
+    <w:lvl w:ilvl="1" w:tplc="40090003">
+      <w:start w:val="1"/>
+      <w:numFmt w:val="bullet"/>
+      <w:lvlText w:val="o"/>
+      <w:lvlJc w:val="left"/>
+      <w:pPr>
+        <w:ind w:left="1440" w:hanging="360"/>
+      </w:pPr>
+      <w:rPr>
+        <w:rFonts w:ascii="Courier New" w:hAnsi="Courier New" w:cs="Courier New" w:hint="default"/>
+      </w:rPr>
+    </w:lvl>
+    <w:lvl w:ilvl="2" w:tplc="40090005" w:tentative="1">
+      <w:start w:val="1"/>
+      <w:numFmt w:val="bullet"/>
+      <w:lvlText w:val=""/>
+      <w:lvlJc w:val="left"/>
+      <w:pPr>
+        <w:ind w:left="2160" w:hanging="360"/>
+      </w:pPr>
+      <w:rPr>
+        <w:rFonts w:ascii="Wingdings" w:hAnsi="Wingdings" w:hint="default"/>
+      </w:rPr>
+    </w:lvl>
+    <w:lvl w:ilvl="3" w:tplc="40090001" w:tentative="1">
+      <w:start w:val="1"/>
+      <w:numFmt w:val="bullet"/>
+      <w:lvlText w:val=""/>
+      <w:lvlJc w:val="left"/>
+      <w:pPr>
+        <w:ind w:left="2880" w:hanging="360"/>
+      </w:pPr>
+      <w:rPr>
+        <w:rFonts w:ascii="Symbol" w:hAnsi="Symbol" w:hint="default"/>
+      </w:rPr>
+    </w:lvl>
+    <w:lvl w:ilvl="4" w:tplc="40090003" w:tentative="1">
+      <w:start w:val="1"/>
+      <w:numFmt w:val="bullet"/>
+      <w:lvlText w:val="o"/>
+      <w:lvlJc w:val="left"/>
+      <w:pPr>
+        <w:ind w:left="3600" w:hanging="360"/>
+      </w:pPr>
+      <w:rPr>
+        <w:rFonts w:ascii="Courier New" w:hAnsi="Courier New" w:cs="Courier New" w:hint="default"/>
+      </w:rPr>
+    </w:lvl>
+    <w:lvl w:ilvl="5" w:tplc="40090005" w:tentative="1">
+      <w:start w:val="1"/>
+      <w:numFmt w:val="bullet"/>
+      <w:lvlText w:val=""/>
+      <w:lvlJc w:val="left"/>
+      <w:pPr>
+        <w:ind w:left="4320" w:hanging="360"/>
+      </w:pPr>
+      <w:rPr>
+        <w:rFonts w:ascii="Wingdings" w:hAnsi="Wingdings" w:hint="default"/>
+      </w:rPr>
+    </w:lvl>
+    <w:lvl w:ilvl="6" w:tplc="40090001" w:tentative="1">
+      <w:start w:val="1"/>
+      <w:numFmt w:val="bullet"/>
+      <w:lvlText w:val=""/>
+      <w:lvlJc w:val="left"/>
+      <w:pPr>
+        <w:ind w:left="5040" w:hanging="360"/>
+      </w:pPr>
+      <w:rPr>
+        <w:rFonts w:ascii="Symbol" w:hAnsi="Symbol" w:hint="default"/>
+      </w:rPr>
+    </w:lvl>
+    <w:lvl w:ilvl="7" w:tplc="40090003" w:tentative="1">
+      <w:start w:val="1"/>
+      <w:numFmt w:val="bullet"/>
+      <w:lvlText w:val="o"/>
+      <w:lvlJc w:val="left"/>
+      <w:pPr>
+        <w:ind w:left="5760" w:hanging="360"/>
+      </w:pPr>
+      <w:rPr>
+        <w:rFonts w:ascii="Courier New" w:hAnsi="Courier New" w:cs="Courier New" w:hint="default"/>
+      </w:rPr>
+    </w:lvl>
+    <w:lvl w:ilvl="8" w:tplc="40090005" w:tentative="1">
+      <w:start w:val="1"/>
+      <w:numFmt w:val="bullet"/>
+      <w:lvlText w:val=""/>
+      <w:lvlJc w:val="left"/>
+      <w:pPr>
+        <w:ind w:left="6480" w:hanging="360"/>
+      </w:pPr>
+      <w:rPr>
+        <w:rFonts w:ascii="Wingdings" w:hAnsi="Wingdings" w:hint="default"/>
+      </w:rPr>
+    </w:lvl>
+  </w:abstractNum>
   <w:num w:numId="1" w16cid:durableId="1172841480">
-    <w:abstractNumId w:val="0"/>
+    <w:abstractNumId w:val="1"/>
   </w:num>
   <w:num w:numId="2" w16cid:durableId="246309915">
-    <w:abstractNumId w:val="1"/>
+    <w:abstractNumId w:val="3"/>
+  </w:num>
+  <w:num w:numId="3" w16cid:durableId="279453749">
+    <w:abstractNumId w:val="5"/>
+  </w:num>
+  <w:num w:numId="4" w16cid:durableId="792480890">
+    <w:abstractNumId w:val="2"/>
+  </w:num>
+  <w:num w:numId="5" w16cid:durableId="291056840">
+    <w:abstractNumId w:val="4"/>
+  </w:num>
+  <w:num w:numId="6" w16cid:durableId="177891526">
+    <w:abstractNumId w:val="6"/>
+  </w:num>
+  <w:num w:numId="7" w16cid:durableId="165285821">
+    <w:abstractNumId w:val="8"/>
+  </w:num>
+  <w:num w:numId="8" w16cid:durableId="1709798363">
+    <w:abstractNumId w:val="7"/>
+  </w:num>
+  <w:num w:numId="9" w16cid:durableId="1090734490">
+    <w:abstractNumId w:val="0"/>
   </w:num>
 </w:numbering>
 </file>
@@ -3424,7 +5136,6 @@
   <w:style w:type="character" w:default="1" w:styleId="DefaultParagraphFont">
     <w:name w:val="Default Paragraph Font"/>
     <w:uiPriority w:val="1"/>
-    <w:semiHidden/>
     <w:unhideWhenUsed/>
   </w:style>
   <w:style w:type="table" w:default="1" w:styleId="TableNormal">
@@ -3864,6 +5575,22 @@
       <w:shd w:val="clear" w:color="auto" w:fill="E1DFDD"/>
     </w:rPr>
   </w:style>
+  <w:style w:type="paragraph" w:styleId="NormalWeb">
+    <w:name w:val="Normal (Web)"/>
+    <w:basedOn w:val="Normal"/>
+    <w:uiPriority w:val="99"/>
+    <w:unhideWhenUsed/>
+    <w:rsid w:val="00A82C5B"/>
+    <w:pPr>
+      <w:spacing w:before="100" w:beforeAutospacing="1" w:after="100" w:afterAutospacing="1" w:line="240" w:lineRule="auto"/>
+    </w:pPr>
+    <w:rPr>
+      <w:rFonts w:ascii="Times New Roman" w:eastAsia="Times New Roman" w:hAnsi="Times New Roman" w:cs="Times New Roman"/>
+      <w:kern w:val="0"/>
+      <w:lang w:eastAsia="en-IN"/>
+      <w14:ligatures w14:val="none"/>
+    </w:rPr>
+  </w:style>
 </w:styles>
 </file>
 
@@ -3962,10 +5689,12 @@
   <w:rsids>
     <w:rsidRoot w:val="00147410"/>
     <w:rsid w:val="00147410"/>
+    <w:rsid w:val="003541EE"/>
     <w:rsid w:val="00501E2C"/>
     <w:rsid w:val="00651F33"/>
     <w:rsid w:val="00757795"/>
     <w:rsid w:val="007C6A9E"/>
+    <w:rsid w:val="00863153"/>
     <w:rsid w:val="00AD713B"/>
   </w:rsids>
   <m:mathPr>

</xml_diff>